<commit_message>
feat(interviews): nâng cấp hệ thống phỏng vấn thoại tiếng việt và cải thiện khớp nối cv
</commit_message>
<xml_diff>
--- a/docs/product/MARKET-READINESS-AUDIT.docx
+++ b/docs/product/MARKET-READINESS-AUDIT.docx
@@ -267,6 +267,85 @@
     </w:p>
     <w:p>
       <w:r>
+        <w:rPr>
+          <w:b/>
+        </w:rPr>
+        <w:t>Cập nhật 09/10/2026:</w:t>
+      </w:r>
+      <w:r>
+        <w:t xml:space="preserve"> B-1, B-2, B-6 đã sửa trong code kèm test (</w:t>
+      </w:r>
+      <w:r>
+        <w:rPr>
+          <w:rFonts w:ascii="Consolas" w:hAnsi="Consolas"/>
+          <w:color w:val="1B3A6B"/>
+        </w:rPr>
+        <w:t>tests/modules/matching/test_router.py</w:t>
+      </w:r>
+      <w:r>
+        <w:t xml:space="preserve">, </w:t>
+      </w:r>
+      <w:r>
+        <w:rPr>
+          <w:rFonts w:ascii="Consolas" w:hAnsi="Consolas"/>
+          <w:color w:val="1B3A6B"/>
+        </w:rPr>
+        <w:t>tests/modules/interviews/test_candidate_boundary.py</w:t>
+      </w:r>
+      <w:r>
+        <w:t>).</w:t>
+      </w:r>
+    </w:p>
+    <w:p>
+      <w:r>
+        <w:rPr>
+          <w:b/>
+        </w:rPr>
+        <w:t>Cập nhật 10/10/2026:</w:t>
+      </w:r>
+      <w:r>
+        <w:t xml:space="preserve"> B-4 đã sửa. </w:t>
+      </w:r>
+      <w:r>
+        <w:rPr>
+          <w:b/>
+        </w:rPr>
+        <w:t>Đính chính:</w:t>
+      </w:r>
+      <w:r>
+        <w:t xml:space="preserve"> bản 09/10 mô tả sai B-4. Các chuỗi "98% Accuracy", "Sentiment Analysis Engine" và lời chứng thực hư cấu có trong </w:t>
+      </w:r>
+      <w:r>
+        <w:rPr>
+          <w:rFonts w:ascii="Consolas" w:hAnsi="Consolas"/>
+          <w:color w:val="1B3A6B"/>
+        </w:rPr>
+        <w:t>i18n.ts</w:t>
+      </w:r>
+      <w:r>
+        <w:t xml:space="preserve"> nhưng </w:t>
+      </w:r>
+      <w:r>
+        <w:rPr>
+          <w:b/>
+        </w:rPr>
+        <w:t>không trang nào hiển thị</w:t>
+      </w:r>
+      <w:r>
+        <w:t xml:space="preserve"> (không có tham chiếu); đã xóa để tránh bị nối lại sau này. Những tuyên bố sai mà người dùng </w:t>
+      </w:r>
+      <w:r>
+        <w:rPr>
+          <w:b/>
+        </w:rPr>
+        <w:t>thật sự nhìn thấy</w:t>
+      </w:r>
+      <w:r>
+        <w:t xml:space="preserve"> là: modal VietQR hiển thị số tài khoản và báo "tài khoản đã được nâng cấp" sau một lần chuyển khoản giả; mô tả hình thức phỏng vấn tiếng Việt nói có "phân tích giọng điệu", "cảm xúc", "biểu cảm"; danh sách tính năng gói có "phân tích từ khóa ATS" không tồn tại; trang Cài đặt báo đổi mật khẩu / xóa tài khoản thành công dù không gọi máy chủ. Tất cả đã được sửa thành thông báo trung thực hoặc khóa lại với nhãn "chưa hỗ trợ". B-3 (thanh toán thật) và B-5 (đồng ý, xóa dữ liệu) vẫn chặn ra mắt.</w:t>
+      </w:r>
+    </w:p>
+    <w:p>
+      <w:r>
         <w:t xml:space="preserve">B-1, B-2, B-4, B-6 chặn </w:t>
       </w:r>
       <w:r>
@@ -396,6 +475,15 @@
           </w:tcPr>
           <w:p>
             <w:r/>
+            <w:r>
+              <w:rPr>
+                <w:b/>
+              </w:rPr>
+              <w:t>[Đã sửa 09/10]</w:t>
+            </w:r>
+            <w:r>
+              <w:t xml:space="preserve"> </w:t>
+            </w:r>
             <w:r>
               <w:rPr>
                 <w:b/>
@@ -546,6 +634,15 @@
               <w:rPr>
                 <w:b/>
               </w:rPr>
+              <w:t>[Đã sửa 09/10]</w:t>
+            </w:r>
+            <w:r>
+              <w:t xml:space="preserve"> </w:t>
+            </w:r>
+            <w:r>
+              <w:rPr>
+                <w:b/>
+              </w:rPr>
               <w:t>Ứng viên thấy nhãn tuyển/loại.</w:t>
             </w:r>
             <w:r>
@@ -691,10 +788,19 @@
               <w:rPr>
                 <w:b/>
               </w:rPr>
-              <w:t>Tuyên bố marketing không có căn cứ.</w:t>
+              <w:t>[Đã sửa 10/10 — xem đính chính ở trên]</w:t>
             </w:r>
             <w:r>
-              <w:t xml:space="preserve"> "98% Accuracy", "Sentiment Analysis Engine", lời chứng thực của nhân vật hư cấu.</w:t>
+              <w:t xml:space="preserve"> </w:t>
+            </w:r>
+            <w:r>
+              <w:rPr>
+                <w:b/>
+              </w:rPr>
+              <w:t>Tuyên bố không có căn cứ mà người dùng nhìn thấy:</w:t>
+            </w:r>
+            <w:r>
+              <w:t xml:space="preserve"> modal VietQR báo nâng cấp sau chuyển khoản giả, mô tả hình thức phỏng vấn nói có phân tích cảm xúc/giọng điệu, tính năng gói không tồn tại, cài đặt báo thành công giả.</w:t>
             </w:r>
           </w:p>
         </w:tc>
@@ -712,7 +818,7 @@
                 <w:rFonts w:ascii="Consolas" w:hAnsi="Consolas"/>
                 <w:color w:val="1B3A6B"/>
               </w:rPr>
-              <w:t>i18n.ts:1368-1369</w:t>
+              <w:t>VietQrModal.tsx</w:t>
             </w:r>
             <w:r>
               <w:t xml:space="preserve">, </w:t>
@@ -722,7 +828,27 @@
                 <w:rFonts w:ascii="Consolas" w:hAnsi="Consolas"/>
                 <w:color w:val="1B3A6B"/>
               </w:rPr>
-              <w:t>:3506-3514</w:t>
+              <w:t>i18n.ts</w:t>
+            </w:r>
+            <w:r>
+              <w:t xml:space="preserve">, </w:t>
+            </w:r>
+            <w:r>
+              <w:rPr>
+                <w:rFonts w:ascii="Consolas" w:hAnsi="Consolas"/>
+                <w:color w:val="1B3A6B"/>
+              </w:rPr>
+              <w:t>pricing.data.ts</w:t>
+            </w:r>
+            <w:r>
+              <w:t xml:space="preserve">, </w:t>
+            </w:r>
+            <w:r>
+              <w:rPr>
+                <w:rFonts w:ascii="Consolas" w:hAnsi="Consolas"/>
+                <w:color w:val="1B3A6B"/>
+              </w:rPr>
+              <w:t>dashboard/settings/page.tsx</w:t>
             </w:r>
           </w:p>
         </w:tc>
@@ -808,6 +934,15 @@
           </w:tcPr>
           <w:p>
             <w:r/>
+            <w:r>
+              <w:rPr>
+                <w:b/>
+              </w:rPr>
+              <w:t>[Đã sửa 09/10]</w:t>
+            </w:r>
+            <w:r>
+              <w:t xml:space="preserve"> </w:t>
+            </w:r>
             <w:r>
               <w:rPr>
                 <w:b/>

</xml_diff>